<commit_message>
#12 fix: update report
</commit_message>
<xml_diff>
--- a/PredictingStellarClass_Chapter1-7.docx
+++ b/PredictingStellarClass_Chapter1-7.docx
@@ -57,6 +57,14 @@
     <w:bookmarkStart w:id="0" w:name="_Toc236131370" w:displacedByCustomXml="next"/>
     <w:sdt>
       <w:sdtPr>
+        <w:rPr>
+          <w:rFonts w:eastAsia="Times New Roman" w:cs="Times New Roman"/>
+          <w:b w:val="0"/>
+          <w:bCs w:val="0"/>
+          <w:color w:val="auto"/>
+          <w:sz w:val="20"/>
+          <w:szCs w:val="20"/>
+        </w:rPr>
         <w:id w:val="1234902011"/>
         <w:docPartObj>
           <w:docPartGallery w:val="Table of Contents"/>
@@ -65,11 +73,7 @@
       </w:sdtPr>
       <w:sdtEndPr>
         <w:rPr>
-          <w:rFonts w:eastAsia="Times New Roman" w:cs="Times New Roman"/>
           <w:noProof/>
-          <w:color w:val="auto"/>
-          <w:sz w:val="20"/>
-          <w:szCs w:val="20"/>
         </w:rPr>
       </w:sdtEndPr>
       <w:sdtContent>
@@ -13022,7 +13026,7 @@
           <w:noProof/>
         </w:rPr>
         <w:drawing>
-          <wp:inline distT="0" distB="0" distL="0" distR="0" wp14:anchorId="203F80F2" wp14:editId="6302803B">
+          <wp:inline distT="0" distB="0" distL="0" distR="0" wp14:anchorId="203F80F2" wp14:editId="6B2DCCD3">
             <wp:extent cx="6057900" cy="4849495"/>
             <wp:effectExtent l="0" t="0" r="0" b="8255"/>
             <wp:docPr id="625414751" name="Picture 1"/>
@@ -14341,7 +14345,7 @@
         </w:rPr>
         <w:lastRenderedPageBreak/>
         <w:drawing>
-          <wp:inline distT="0" distB="0" distL="0" distR="0" wp14:anchorId="62D08E8B" wp14:editId="5D6ABDDC">
+          <wp:inline distT="0" distB="0" distL="0" distR="0" wp14:anchorId="62D08E8B" wp14:editId="411203EF">
             <wp:extent cx="6057900" cy="3028950"/>
             <wp:effectExtent l="0" t="0" r="0" b="0"/>
             <wp:docPr id="1277584325" name="Picture 2"/>
@@ -14498,7 +14502,7 @@
         </w:rPr>
         <w:lastRenderedPageBreak/>
         <w:drawing>
-          <wp:inline distT="0" distB="0" distL="0" distR="0" wp14:anchorId="7BE10DCF" wp14:editId="18E9D3B0">
+          <wp:inline distT="0" distB="0" distL="0" distR="0" wp14:anchorId="7BE10DCF" wp14:editId="0FA4D1D1">
             <wp:extent cx="6057900" cy="3786505"/>
             <wp:effectExtent l="0" t="0" r="0" b="4445"/>
             <wp:docPr id="245489826" name="Picture 3"/>
@@ -14969,7 +14973,7 @@
           <w:noProof/>
         </w:rPr>
         <w:drawing>
-          <wp:inline distT="0" distB="0" distL="0" distR="0" wp14:anchorId="327C1E98" wp14:editId="2167746A">
+          <wp:inline distT="0" distB="0" distL="0" distR="0" wp14:anchorId="327C1E98" wp14:editId="6D63258F">
             <wp:extent cx="6057900" cy="3750945"/>
             <wp:effectExtent l="0" t="0" r="0" b="1905"/>
             <wp:docPr id="1719022724" name="Picture 4"/>
@@ -15087,7 +15091,7 @@
           <w:noProof/>
         </w:rPr>
         <w:drawing>
-          <wp:inline distT="0" distB="0" distL="0" distR="0" wp14:anchorId="691E3502" wp14:editId="12855DAD">
+          <wp:inline distT="0" distB="0" distL="0" distR="0" wp14:anchorId="691E3502" wp14:editId="5A403CA3">
             <wp:extent cx="6057900" cy="3750945"/>
             <wp:effectExtent l="0" t="0" r="0" b="1905"/>
             <wp:docPr id="387372512" name="Picture 3"/>

</xml_diff>